<commit_message>
Project report: replace the research plan with Phase 1-6 results and claim verdicts
</commit_message>
<xml_diff>
--- a/docs/project_report.docx
+++ b/docs/project_report.docx
@@ -170,7 +170,7 @@
     </w:p>
     <w:p>
       <w:r>
-        <w:t>This project set out to compare XceptionNet, a pretrained convolutional baseline, against a CNN-ViT hybrid (ResNet-50 stages 1-3 feeding a 6-layer Transformer encoder, trained from scratch) for deepfake detection on FaceForensics++ (FF++), measuring not just same-distribution accuracy but cross-manipulation generalization and compression robustness. XceptionNet outperformed the hybrid on every same-distribution metric (video AUC 0.9958 vs. 0.9836), so the original hypothesis -- that global self-attention would generalize better -- did not hold; this is reported as a negative result rather than reframed after the fact. The more consequential finding emerged from the cross-manipulation matrix: several transfer cells, concentrated around FaceSwap, score *below random chance* (e.g. Xception trained on Deepfakes and tested on FaceSwap: AUC 0.2562), and this pattern correlates almost perfectly between the two architectures (Pearson r = 0.9377, Spearman rho = 0.951, p &lt; 0.001), indicating the failure tracks the training manipulation method rather than model architecture. Before treating this as a genuine finding, a dedicated audit (Phase 0 of a new research plan, RESEARCH_BRIEF.md) checked for a trivial pipeline explanation -- systematic differences in video encoding, face-crop quality, or label handling between real and manipulated classes -- and found none. The project is now pursuing this inversion as its central, publishable contribution: testing whether it is preprocessing-driven or a genuine mechanism, identifying the image-level statistic responsible, and testing interventions that fix it.</w:t>
+        <w:t>This project set out to compare XceptionNet, a pretrained convolutional baseline, against a CNN-ViT hybrid (ResNet-50 stages 1-3 feeding a 6-layer Transformer encoder, trained from scratch) for deepfake detection on FaceForensics++ (FF++), measuring not just same-distribution accuracy but cross-manipulation generalization and compression robustness. XceptionNet outperformed the hybrid on every same-distribution metric (video AUC 0.9958 vs. 0.9836), so the original hypothesis -- that global self-attention would generalize better -- did not hold; this is reported as a negative result rather than reframed after the fact. The more consequential finding emerged from the cross-manipulation matrix: several transfer cells, concentrated around FaceSwap, score *below random chance* (e.g. Xception trained on Deepfakes and tested on FaceSwap: AUC 0.2562), and this pattern correlates almost perfectly between the two architectures (Pearson r = 0.9377, Spearman rho = 0.951, p &lt; 0.001), indicating the failure tracks the training manipulation method rather than model architecture. Before treating this as a genuine finding, a dedicated audit (Phase 0 of a new research plan, RESEARCH_BRIEF.md) checked for a trivial pipeline explanation -- systematic differences in video encoding, face-crop quality, or label handling between real and manipulated classes -- and found none. A six-phase follow-up study then showed that the inversion survives a complete change of preprocessing and appears identically in three ImageNet-pretrained architectures; that it follows a difference in high-frequency image energy whose direction flips between manipulation methods (Deepfakes and NeuralTextures fakes are blurrier than real faces, FaceSwap fakes sharper), which predicts both our transfer matrices and a published official-data matrix; and that randomizing sharpness during training reduces the inversion by about 0.1 AUC without removing it. The explanation does not carry over to a second dataset (DeepFakeFace), so it is stated as specific to FaceForensics++.</w:t>
       </w:r>
     </w:p>
     <w:p>
@@ -1925,12 +1925,12 @@
         <w:pStyle w:val="Heading1"/>
       </w:pPr>
       <w:r>
-        <w:t>7. Research Plan: Explaining and Fixing the Inversion</w:t>
+        <w:t>7. Research Results: Why Transfer Inverts</w:t>
       </w:r>
     </w:p>
     <w:p>
       <w:r>
-        <w:t>Working title: "Inverted Transfer -- Why Deepfake Detectors Score Unseen Manipulations Below Chance, and How Preprocessing Toggles It." Full plan, phase-by-phase with gates and ground rules, lives in RESEARCH_BRIEF.md in the repository; progress against it is logged after every phase in docs/PROGRESS.md.</w:t>
+        <w:t>The below-chance cells in §4.2 were turned into a research question with four falsifiable claims (RESEARCH_BRIEF.md): C1, the inversion depends on preprocessing; C2, it follows a measurable low-level image statistic whose direction differs between manipulation methods; C3, neutralizing that statistic during training reduces it; C4, it does not depend on the architecture. All results below use the Kaggle mirror (preliminary), three seeds for Xception and two for the other conditions, video-level AUC with 95% bootstrap CIs over the 280 test videos; a cell is called below chance only when its whole CI is under 0.5. Full log: docs/PROGRESS.md.</w:t>
       </w:r>
     </w:p>
     <w:p>
@@ -1938,76 +1938,12 @@
         <w:pStyle w:val="Heading2"/>
       </w:pPr>
       <w:r>
-        <w:t>7.1 Falsifiable Claims</w:t>
-      </w:r>
-    </w:p>
-    <w:p>
-      <w:pPr>
-        <w:pStyle w:val="ListBullet"/>
-      </w:pPr>
-      <w:r>
-        <w:rPr>
-          <w:b/>
-        </w:rPr>
-        <w:t xml:space="preserve">C1 -- Preprocessing sensitivity. </w:t>
-      </w:r>
-      <w:r>
-        <w:t>For the same architecture, does cross-manipulation AUC on the DF/FS cells shift substantially, possibly across the 0.5 line, with preprocessing choices alone (detector, margin, storage format, alignment, frame count, data source)?</w:t>
-      </w:r>
-    </w:p>
-    <w:p>
-      <w:pPr>
-        <w:pStyle w:val="ListBullet"/>
-      </w:pPr>
-      <w:r>
-        <w:rPr>
-          <w:b/>
-        </w:rPr>
-        <w:t xml:space="preserve">C2 -- Inversion mechanism. </w:t>
-      </w:r>
-      <w:r>
-        <w:t>Do detectors latch onto a low-level statistic (sharpness, high-frequency energy, boundary contrast, resolution/JPEG mismatch) whose sign relative to real faces differs between manipulation methods, predicting which transfer cells fall below chance?</w:t>
-      </w:r>
-    </w:p>
-    <w:p>
-      <w:pPr>
-        <w:pStyle w:val="ListBullet"/>
-      </w:pPr>
-      <w:r>
-        <w:rPr>
-          <w:b/>
-        </w:rPr>
-        <w:t xml:space="preserve">C3 -- Intervention. </w:t>
-      </w:r>
-      <w:r>
-        <w:t>Does neutralizing that statistic during training move the below-chance cells back toward or above 0.5 for both architectures, without a large in-domain accuracy drop?</w:t>
-      </w:r>
-    </w:p>
-    <w:p>
-      <w:pPr>
-        <w:pStyle w:val="ListBullet"/>
-      </w:pPr>
-      <w:r>
-        <w:rPr>
-          <w:b/>
-        </w:rPr>
-        <w:t xml:space="preserve">C4 -- Architecture independence. </w:t>
-      </w:r>
-      <w:r>
-        <w:t>Are transfer matrices more similar across architectures than across training methods -- i.e. does architecture explain little variance in cross-manipulation AUC? (First evidence for this is the r≈0.94 correlation in §5.)</w:t>
+        <w:t>7.1 Phase 1: The Inversion Survives a Full Preprocessing Change</w:t>
       </w:r>
     </w:p>
     <w:p>
       <w:r>
-        <w:t>Explicitly not claimed: that below-chance cross-domain AUC is a novel observation in the literature (prior work has reported it, with a resolution-bias explanation -- this project extends that with a within-FF++, FaceSwap-centred account, sign prediction from measured statistics, and interventions); that the hybrid is better or worse "in general" (the architecture comparison is confounded by pretraining and input resolution); anything about official c40 from the proxy; and no number from the Kaggle mirror is presented as official-data evidence.</w:t>
-      </w:r>
-    </w:p>
-    <w:p>
-      <w:pPr>
-        <w:pStyle w:val="Heading2"/>
-      </w:pPr>
-      <w:r>
-        <w:t>7.2 Phase Plan</w:t>
+        <w:t>A reference pipeline changed every preprocessing choice at once: dlib face detection with 68-landmark alignment instead of MTCNN, PNG instead of JPEG, 256 px crops, 32 frames per video. Xception was retrained on Deepfakes-only and FaceSwap-only, three seeds each.</w:t>
       </w:r>
     </w:p>
     <w:tbl>
@@ -2019,14 +1955,15 @@
         <w:tblLook w:firstColumn="1" w:firstRow="1" w:lastColumn="0" w:lastRow="0" w:noHBand="0" w:noVBand="1" w:val="04A0"/>
       </w:tblPr>
       <w:tblGrid>
-        <w:gridCol w:w="720"/>
-        <w:gridCol w:w="6624"/>
-        <w:gridCol w:w="1440"/>
+        <w:gridCol w:w="1584"/>
+        <w:gridCol w:w="1872"/>
+        <w:gridCol w:w="3456"/>
+        <w:gridCol w:w="1872"/>
       </w:tblGrid>
       <w:tr>
         <w:tc>
           <w:tcPr>
-            <w:tcW w:type="dxa" w:w="720"/>
+            <w:tcW w:type="dxa" w:w="1584"/>
           </w:tcPr>
           <w:p>
             <w:r>
@@ -2034,13 +1971,13 @@
                 <w:b/>
                 <w:sz w:val="20"/>
               </w:rPr>
-              <w:t>Phase</w:t>
+              <w:t>Cell</w:t>
             </w:r>
           </w:p>
         </w:tc>
         <w:tc>
           <w:tcPr>
-            <w:tcW w:type="dxa" w:w="6624"/>
+            <w:tcW w:type="dxa" w:w="1872"/>
           </w:tcPr>
           <w:p>
             <w:r>
@@ -2048,7 +1985,1746 @@
                 <w:b/>
                 <w:sz w:val="20"/>
               </w:rPr>
-              <w:t>Focus</w:t>
+              <w:t>Original pipeline</w:t>
+            </w:r>
+          </w:p>
+        </w:tc>
+        <w:tc>
+          <w:tcPr>
+            <w:tcW w:type="dxa" w:w="3456"/>
+          </w:tcPr>
+          <w:p>
+            <w:r>
+              <w:rPr>
+                <w:b/>
+                <w:sz w:val="20"/>
+              </w:rPr>
+              <w:t>Reference pipeline (3 seeds)</w:t>
+            </w:r>
+          </w:p>
+        </w:tc>
+        <w:tc>
+          <w:tcPr>
+            <w:tcW w:type="dxa" w:w="1872"/>
+          </w:tcPr>
+          <w:p>
+            <w:r>
+              <w:rPr>
+                <w:b/>
+                <w:sz w:val="20"/>
+              </w:rPr>
+              <w:t>Call</w:t>
+            </w:r>
+          </w:p>
+        </w:tc>
+      </w:tr>
+      <w:tr>
+        <w:tc>
+          <w:tcPr>
+            <w:tcW w:type="dxa" w:w="1584"/>
+          </w:tcPr>
+          <w:p>
+            <w:r>
+              <w:rPr>
+                <w:b/>
+                <w:color w:val="B42E0A"/>
+                <w:sz w:val="20"/>
+              </w:rPr>
+              <w:t>DF → FS</w:t>
+            </w:r>
+          </w:p>
+        </w:tc>
+        <w:tc>
+          <w:tcPr>
+            <w:tcW w:type="dxa" w:w="1872"/>
+          </w:tcPr>
+          <w:p>
+            <w:r>
+              <w:rPr>
+                <w:b/>
+                <w:color w:val="B42E0A"/>
+                <w:sz w:val="20"/>
+              </w:rPr>
+              <w:t>0.256</w:t>
+            </w:r>
+          </w:p>
+        </w:tc>
+        <w:tc>
+          <w:tcPr>
+            <w:tcW w:type="dxa" w:w="3456"/>
+          </w:tcPr>
+          <w:p>
+            <w:r>
+              <w:rPr>
+                <w:b/>
+                <w:color w:val="B42E0A"/>
+                <w:sz w:val="20"/>
+              </w:rPr>
+              <w:t>0.258 [0.21, 0.31]</w:t>
+            </w:r>
+          </w:p>
+        </w:tc>
+        <w:tc>
+          <w:tcPr>
+            <w:tcW w:type="dxa" w:w="1872"/>
+          </w:tcPr>
+          <w:p>
+            <w:r>
+              <w:rPr>
+                <w:b/>
+                <w:color w:val="B42E0A"/>
+                <w:sz w:val="20"/>
+              </w:rPr>
+              <w:t>below chance</w:t>
+            </w:r>
+          </w:p>
+        </w:tc>
+      </w:tr>
+      <w:tr>
+        <w:tc>
+          <w:tcPr>
+            <w:tcW w:type="dxa" w:w="1584"/>
+          </w:tcPr>
+          <w:p>
+            <w:r>
+              <w:rPr>
+                <w:b/>
+                <w:color w:val="B42E0A"/>
+                <w:sz w:val="20"/>
+              </w:rPr>
+              <w:t>FS → NT</w:t>
+            </w:r>
+          </w:p>
+        </w:tc>
+        <w:tc>
+          <w:tcPr>
+            <w:tcW w:type="dxa" w:w="1872"/>
+          </w:tcPr>
+          <w:p>
+            <w:r>
+              <w:rPr>
+                <w:b/>
+                <w:color w:val="B42E0A"/>
+                <w:sz w:val="20"/>
+              </w:rPr>
+              <w:t>0.395</w:t>
+            </w:r>
+          </w:p>
+        </w:tc>
+        <w:tc>
+          <w:tcPr>
+            <w:tcW w:type="dxa" w:w="3456"/>
+          </w:tcPr>
+          <w:p>
+            <w:r>
+              <w:rPr>
+                <w:b/>
+                <w:color w:val="B42E0A"/>
+                <w:sz w:val="20"/>
+              </w:rPr>
+              <w:t>0.428 [0.37, 0.49]</w:t>
+            </w:r>
+          </w:p>
+        </w:tc>
+        <w:tc>
+          <w:tcPr>
+            <w:tcW w:type="dxa" w:w="1872"/>
+          </w:tcPr>
+          <w:p>
+            <w:r>
+              <w:rPr>
+                <w:b/>
+                <w:color w:val="B42E0A"/>
+                <w:sz w:val="20"/>
+              </w:rPr>
+              <w:t>below chance</w:t>
+            </w:r>
+          </w:p>
+        </w:tc>
+      </w:tr>
+      <w:tr>
+        <w:tc>
+          <w:tcPr>
+            <w:tcW w:type="dxa" w:w="1584"/>
+          </w:tcPr>
+          <w:p>
+            <w:r>
+              <w:rPr>
+                <w:sz w:val="20"/>
+              </w:rPr>
+              <w:t>FS → DF</w:t>
+            </w:r>
+          </w:p>
+        </w:tc>
+        <w:tc>
+          <w:tcPr>
+            <w:tcW w:type="dxa" w:w="1872"/>
+          </w:tcPr>
+          <w:p>
+            <w:r>
+              <w:rPr>
+                <w:sz w:val="20"/>
+              </w:rPr>
+              <w:t>0.501</w:t>
+            </w:r>
+          </w:p>
+        </w:tc>
+        <w:tc>
+          <w:tcPr>
+            <w:tcW w:type="dxa" w:w="3456"/>
+          </w:tcPr>
+          <w:p>
+            <w:r>
+              <w:rPr>
+                <w:sz w:val="20"/>
+              </w:rPr>
+              <w:t>0.469 [0.41, 0.53]</w:t>
+            </w:r>
+          </w:p>
+        </w:tc>
+        <w:tc>
+          <w:tcPr>
+            <w:tcW w:type="dxa" w:w="1872"/>
+          </w:tcPr>
+          <w:p>
+            <w:r>
+              <w:rPr>
+                <w:sz w:val="20"/>
+              </w:rPr>
+              <w:t>at chance</w:t>
+            </w:r>
+          </w:p>
+        </w:tc>
+      </w:tr>
+      <w:tr>
+        <w:tc>
+          <w:tcPr>
+            <w:tcW w:type="dxa" w:w="1584"/>
+          </w:tcPr>
+          <w:p>
+            <w:r>
+              <w:rPr>
+                <w:sz w:val="20"/>
+              </w:rPr>
+              <w:t>DF → F2F</w:t>
+            </w:r>
+          </w:p>
+        </w:tc>
+        <w:tc>
+          <w:tcPr>
+            <w:tcW w:type="dxa" w:w="1872"/>
+          </w:tcPr>
+          <w:p>
+            <w:r>
+              <w:rPr>
+                <w:sz w:val="20"/>
+              </w:rPr>
+              <w:t>0.742</w:t>
+            </w:r>
+          </w:p>
+        </w:tc>
+        <w:tc>
+          <w:tcPr>
+            <w:tcW w:type="dxa" w:w="3456"/>
+          </w:tcPr>
+          <w:p>
+            <w:r>
+              <w:rPr>
+                <w:sz w:val="20"/>
+              </w:rPr>
+              <w:t>0.694 [0.64, 0.75]</w:t>
+            </w:r>
+          </w:p>
+        </w:tc>
+        <w:tc>
+          <w:tcPr>
+            <w:tcW w:type="dxa" w:w="1872"/>
+          </w:tcPr>
+          <w:p>
+            <w:r>
+              <w:rPr>
+                <w:sz w:val="20"/>
+              </w:rPr>
+              <w:t>above chance</w:t>
+            </w:r>
+          </w:p>
+        </w:tc>
+      </w:tr>
+      <w:tr>
+        <w:tc>
+          <w:tcPr>
+            <w:tcW w:type="dxa" w:w="1584"/>
+          </w:tcPr>
+          <w:p>
+            <w:r>
+              <w:rPr>
+                <w:sz w:val="20"/>
+              </w:rPr>
+              <w:t>DF → NT</w:t>
+            </w:r>
+          </w:p>
+        </w:tc>
+        <w:tc>
+          <w:tcPr>
+            <w:tcW w:type="dxa" w:w="1872"/>
+          </w:tcPr>
+          <w:p>
+            <w:r>
+              <w:rPr>
+                <w:sz w:val="20"/>
+              </w:rPr>
+              <w:t>0.812</w:t>
+            </w:r>
+          </w:p>
+        </w:tc>
+        <w:tc>
+          <w:tcPr>
+            <w:tcW w:type="dxa" w:w="3456"/>
+          </w:tcPr>
+          <w:p>
+            <w:r>
+              <w:rPr>
+                <w:sz w:val="20"/>
+              </w:rPr>
+              <w:t>0.758 [0.71, 0.80]</w:t>
+            </w:r>
+          </w:p>
+        </w:tc>
+        <w:tc>
+          <w:tcPr>
+            <w:tcW w:type="dxa" w:w="1872"/>
+          </w:tcPr>
+          <w:p>
+            <w:r>
+              <w:rPr>
+                <w:sz w:val="20"/>
+              </w:rPr>
+              <w:t>above chance</w:t>
+            </w:r>
+          </w:p>
+        </w:tc>
+      </w:tr>
+      <w:tr>
+        <w:tc>
+          <w:tcPr>
+            <w:tcW w:type="dxa" w:w="1584"/>
+          </w:tcPr>
+          <w:p>
+            <w:r>
+              <w:rPr>
+                <w:sz w:val="20"/>
+              </w:rPr>
+              <w:t>FS → F2F</w:t>
+            </w:r>
+          </w:p>
+        </w:tc>
+        <w:tc>
+          <w:tcPr>
+            <w:tcW w:type="dxa" w:w="1872"/>
+          </w:tcPr>
+          <w:p>
+            <w:r>
+              <w:rPr>
+                <w:sz w:val="20"/>
+              </w:rPr>
+              <w:t>0.700</w:t>
+            </w:r>
+          </w:p>
+        </w:tc>
+        <w:tc>
+          <w:tcPr>
+            <w:tcW w:type="dxa" w:w="3456"/>
+          </w:tcPr>
+          <w:p>
+            <w:r>
+              <w:rPr>
+                <w:sz w:val="20"/>
+              </w:rPr>
+              <w:t>0.678 [0.62, 0.73]</w:t>
+            </w:r>
+          </w:p>
+        </w:tc>
+        <w:tc>
+          <w:tcPr>
+            <w:tcW w:type="dxa" w:w="1872"/>
+          </w:tcPr>
+          <w:p>
+            <w:r>
+              <w:rPr>
+                <w:sz w:val="20"/>
+              </w:rPr>
+              <w:t>above chance</w:t>
+            </w:r>
+          </w:p>
+        </w:tc>
+      </w:tr>
+    </w:tbl>
+    <w:p>
+      <w:r>
+        <w:t>The reference pipeline reproduces the original matrix almost cell for cell; DF→FS moves from 0.256 to 0.258. The inversion is not a preprocessing artifact, so the main claim moves from C1 to C2.</w:t>
+      </w:r>
+    </w:p>
+    <w:p>
+      <w:pPr>
+        <w:jc w:val="center"/>
+      </w:pPr>
+      <w:r>
+        <w:drawing>
+          <wp:inline xmlns:a="http://schemas.openxmlformats.org/drawingml/2006/main" xmlns:pic="http://schemas.openxmlformats.org/drawingml/2006/picture">
+            <wp:extent cx="5669280" cy="2348047"/>
+            <wp:docPr id="4" name="Picture 4"/>
+            <wp:cNvGraphicFramePr>
+              <a:graphicFrameLocks noChangeAspect="1"/>
+            </wp:cNvGraphicFramePr>
+            <a:graphic>
+              <a:graphicData uri="http://schemas.openxmlformats.org/drawingml/2006/picture">
+                <pic:pic>
+                  <pic:nvPicPr>
+                    <pic:cNvPr id="0" name="F1_transfer_matrices.png"/>
+                    <pic:cNvPicPr/>
+                  </pic:nvPicPr>
+                  <pic:blipFill>
+                    <a:blip r:embed="rId12"/>
+                    <a:stretch>
+                      <a:fillRect/>
+                    </a:stretch>
+                  </pic:blipFill>
+                  <pic:spPr>
+                    <a:xfrm>
+                      <a:off x="0" y="0"/>
+                      <a:ext cx="5669280" cy="2348047"/>
+                    </a:xfrm>
+                    <a:prstGeom prst="rect"/>
+                  </pic:spPr>
+                </pic:pic>
+              </a:graphicData>
+            </a:graphic>
+          </wp:inline>
+        </w:drawing>
+      </w:r>
+    </w:p>
+    <w:p>
+      <w:pPr>
+        <w:jc w:val="center"/>
+      </w:pPr>
+      <w:r>
+        <w:rPr>
+          <w:i/>
+          <w:color w:val="475569"/>
+          <w:sz w:val="19"/>
+        </w:rPr>
+        <w:t>Figure 4. Transfer matrices, original vs. reference pipeline (Xception).</w:t>
+      </w:r>
+    </w:p>
+    <w:p>
+      <w:pPr>
+        <w:pStyle w:val="Heading2"/>
+      </w:pPr>
+      <w:r>
+        <w:t>7.2 Phase 2: One-Factor Preprocessing Grid</w:t>
+      </w:r>
+    </w:p>
+    <w:p>
+      <w:r>
+        <w:t>Each variant changes one factor of the reference pipeline and is derived from the reference crops (detector and alignment could not be varied separately without re-detecting faces; Phase 1 varied them jointly). Before any variant was evaluated, the high-frequency effect size of each method was measured on each variant's crops and a prediction recorded (commit 2926c86): JPEG q95, JPEG q75 and 10 frames leave the effect sizes unchanged, so the inversion should persist; the tight margin roughly halves them, so the inversion should weaken.</w:t>
+      </w:r>
+    </w:p>
+    <w:tbl>
+      <w:tblPr>
+        <w:tblStyle w:val="LightGrid-Accent1"/>
+        <w:tblW w:type="auto" w:w="0"/>
+        <w:jc w:val="center"/>
+        <w:tblLayout w:type="fixed"/>
+        <w:tblLook w:firstColumn="1" w:firstRow="1" w:lastColumn="0" w:lastRow="0" w:noHBand="0" w:noVBand="1" w:val="04A0"/>
+      </w:tblPr>
+      <w:tblGrid>
+        <w:gridCol w:w="2304"/>
+        <w:gridCol w:w="2736"/>
+        <w:gridCol w:w="2736"/>
+        <w:gridCol w:w="1152"/>
+      </w:tblGrid>
+      <w:tr>
+        <w:tc>
+          <w:tcPr>
+            <w:tcW w:type="dxa" w:w="2304"/>
+          </w:tcPr>
+          <w:p>
+            <w:r>
+              <w:rPr>
+                <w:b/>
+                <w:sz w:val="20"/>
+              </w:rPr>
+              <w:t>Variant</w:t>
+            </w:r>
+          </w:p>
+        </w:tc>
+        <w:tc>
+          <w:tcPr>
+            <w:tcW w:type="dxa" w:w="2736"/>
+          </w:tcPr>
+          <w:p>
+            <w:r>
+              <w:rPr>
+                <w:b/>
+                <w:sz w:val="20"/>
+              </w:rPr>
+              <w:t>DF → FS</w:t>
+            </w:r>
+          </w:p>
+        </w:tc>
+        <w:tc>
+          <w:tcPr>
+            <w:tcW w:type="dxa" w:w="2736"/>
+          </w:tcPr>
+          <w:p>
+            <w:r>
+              <w:rPr>
+                <w:b/>
+                <w:sz w:val="20"/>
+              </w:rPr>
+              <w:t>FS → NT</w:t>
+            </w:r>
+          </w:p>
+        </w:tc>
+        <w:tc>
+          <w:tcPr>
+            <w:tcW w:type="dxa" w:w="1152"/>
+          </w:tcPr>
+          <w:p>
+            <w:r>
+              <w:rPr>
+                <w:b/>
+                <w:sz w:val="20"/>
+              </w:rPr>
+              <w:t>FS hf d</w:t>
+            </w:r>
+          </w:p>
+        </w:tc>
+      </w:tr>
+      <w:tr>
+        <w:tc>
+          <w:tcPr>
+            <w:tcW w:type="dxa" w:w="2304"/>
+          </w:tcPr>
+          <w:p>
+            <w:r>
+              <w:rPr>
+                <w:sz w:val="20"/>
+              </w:rPr>
+              <w:t>Reference (3 seeds)</w:t>
+            </w:r>
+          </w:p>
+        </w:tc>
+        <w:tc>
+          <w:tcPr>
+            <w:tcW w:type="dxa" w:w="2736"/>
+          </w:tcPr>
+          <w:p>
+            <w:r>
+              <w:rPr>
+                <w:sz w:val="20"/>
+              </w:rPr>
+              <w:t>0.258</w:t>
+            </w:r>
+          </w:p>
+        </w:tc>
+        <w:tc>
+          <w:tcPr>
+            <w:tcW w:type="dxa" w:w="2736"/>
+          </w:tcPr>
+          <w:p>
+            <w:r>
+              <w:rPr>
+                <w:sz w:val="20"/>
+              </w:rPr>
+              <w:t>0.428</w:t>
+            </w:r>
+          </w:p>
+        </w:tc>
+        <w:tc>
+          <w:tcPr>
+            <w:tcW w:type="dxa" w:w="1152"/>
+          </w:tcPr>
+          <w:p>
+            <w:r>
+              <w:rPr>
+                <w:sz w:val="20"/>
+              </w:rPr>
+              <w:t>—</w:t>
+            </w:r>
+          </w:p>
+        </w:tc>
+      </w:tr>
+      <w:tr>
+        <w:tc>
+          <w:tcPr>
+            <w:tcW w:type="dxa" w:w="2304"/>
+          </w:tcPr>
+          <w:p>
+            <w:r>
+              <w:rPr>
+                <w:sz w:val="20"/>
+              </w:rPr>
+              <w:t>JPEG q95</w:t>
+            </w:r>
+          </w:p>
+        </w:tc>
+        <w:tc>
+          <w:tcPr>
+            <w:tcW w:type="dxa" w:w="2736"/>
+          </w:tcPr>
+          <w:p>
+            <w:r>
+              <w:rPr>
+                <w:sz w:val="20"/>
+              </w:rPr>
+              <w:t>pending</w:t>
+            </w:r>
+          </w:p>
+        </w:tc>
+        <w:tc>
+          <w:tcPr>
+            <w:tcW w:type="dxa" w:w="2736"/>
+          </w:tcPr>
+          <w:p>
+            <w:r>
+              <w:rPr>
+                <w:sz w:val="20"/>
+              </w:rPr>
+              <w:t>pending</w:t>
+            </w:r>
+          </w:p>
+        </w:tc>
+        <w:tc>
+          <w:tcPr>
+            <w:tcW w:type="dxa" w:w="1152"/>
+          </w:tcPr>
+          <w:p>
+            <w:r>
+              <w:rPr>
+                <w:sz w:val="20"/>
+              </w:rPr>
+              <w:t>+0.33</w:t>
+            </w:r>
+          </w:p>
+        </w:tc>
+      </w:tr>
+      <w:tr>
+        <w:tc>
+          <w:tcPr>
+            <w:tcW w:type="dxa" w:w="2304"/>
+          </w:tcPr>
+          <w:p>
+            <w:r>
+              <w:rPr>
+                <w:sz w:val="20"/>
+              </w:rPr>
+              <w:t>JPEG q75</w:t>
+            </w:r>
+          </w:p>
+        </w:tc>
+        <w:tc>
+          <w:tcPr>
+            <w:tcW w:type="dxa" w:w="2736"/>
+          </w:tcPr>
+          <w:p>
+            <w:r>
+              <w:rPr>
+                <w:sz w:val="20"/>
+              </w:rPr>
+              <w:t>pending</w:t>
+            </w:r>
+          </w:p>
+        </w:tc>
+        <w:tc>
+          <w:tcPr>
+            <w:tcW w:type="dxa" w:w="2736"/>
+          </w:tcPr>
+          <w:p>
+            <w:r>
+              <w:rPr>
+                <w:sz w:val="20"/>
+              </w:rPr>
+              <w:t>pending</w:t>
+            </w:r>
+          </w:p>
+        </w:tc>
+        <w:tc>
+          <w:tcPr>
+            <w:tcW w:type="dxa" w:w="1152"/>
+          </w:tcPr>
+          <w:p>
+            <w:r>
+              <w:rPr>
+                <w:sz w:val="20"/>
+              </w:rPr>
+              <w:t>+0.30</w:t>
+            </w:r>
+          </w:p>
+        </w:tc>
+      </w:tr>
+      <w:tr>
+        <w:tc>
+          <w:tcPr>
+            <w:tcW w:type="dxa" w:w="2304"/>
+          </w:tcPr>
+          <w:p>
+            <w:r>
+              <w:rPr>
+                <w:sz w:val="20"/>
+              </w:rPr>
+              <w:t>10 frames/video</w:t>
+            </w:r>
+          </w:p>
+        </w:tc>
+        <w:tc>
+          <w:tcPr>
+            <w:tcW w:type="dxa" w:w="2736"/>
+          </w:tcPr>
+          <w:p>
+            <w:r>
+              <w:rPr>
+                <w:sz w:val="20"/>
+              </w:rPr>
+              <w:t>pending</w:t>
+            </w:r>
+          </w:p>
+        </w:tc>
+        <w:tc>
+          <w:tcPr>
+            <w:tcW w:type="dxa" w:w="2736"/>
+          </w:tcPr>
+          <w:p>
+            <w:r>
+              <w:rPr>
+                <w:sz w:val="20"/>
+              </w:rPr>
+              <w:t>pending</w:t>
+            </w:r>
+          </w:p>
+        </w:tc>
+        <w:tc>
+          <w:tcPr>
+            <w:tcW w:type="dxa" w:w="1152"/>
+          </w:tcPr>
+          <w:p>
+            <w:r>
+              <w:rPr>
+                <w:sz w:val="20"/>
+              </w:rPr>
+              <w:t>+0.34</w:t>
+            </w:r>
+          </w:p>
+        </w:tc>
+      </w:tr>
+      <w:tr>
+        <w:tc>
+          <w:tcPr>
+            <w:tcW w:type="dxa" w:w="2304"/>
+          </w:tcPr>
+          <w:p>
+            <w:r>
+              <w:rPr>
+                <w:sz w:val="20"/>
+              </w:rPr>
+              <w:t>Tight 1.0× margin</w:t>
+            </w:r>
+          </w:p>
+        </w:tc>
+        <w:tc>
+          <w:tcPr>
+            <w:tcW w:type="dxa" w:w="2736"/>
+          </w:tcPr>
+          <w:p>
+            <w:r>
+              <w:rPr>
+                <w:sz w:val="20"/>
+              </w:rPr>
+              <w:t>pending</w:t>
+            </w:r>
+          </w:p>
+        </w:tc>
+        <w:tc>
+          <w:tcPr>
+            <w:tcW w:type="dxa" w:w="2736"/>
+          </w:tcPr>
+          <w:p>
+            <w:r>
+              <w:rPr>
+                <w:sz w:val="20"/>
+              </w:rPr>
+              <w:t>pending</w:t>
+            </w:r>
+          </w:p>
+        </w:tc>
+        <w:tc>
+          <w:tcPr>
+            <w:tcW w:type="dxa" w:w="1152"/>
+          </w:tcPr>
+          <w:p>
+            <w:r>
+              <w:rPr>
+                <w:sz w:val="20"/>
+              </w:rPr>
+              <w:t>+0.27</w:t>
+            </w:r>
+          </w:p>
+        </w:tc>
+      </w:tr>
+    </w:tbl>
+    <w:p>
+      <w:r>
+        <w:t>Pending at the time of this build: JPEG q95, JPEG q75, 10 frames/video, Tight 1.0× margin.</w:t>
+      </w:r>
+    </w:p>
+    <w:p>
+      <w:pPr>
+        <w:pStyle w:val="Heading2"/>
+      </w:pPr>
+      <w:r>
+        <w:t>7.3 Phase 3: Mechanism — High-Frequency Energy</w:t>
+      </w:r>
+    </w:p>
+    <w:p>
+      <w:r>
+        <w:t>Eight low-level statistics were measured on every test video. High-frequency energy (share of spectral energy above 0.25 cycles/pixel) is the only one whose shift separates FaceSwap from Deepfakes and NeuralTextures with every CI excluding zero, in both crop sets: Deepfakes and NeuralTextures fakes are blurrier than real faces, FaceSwap fakes are sharper, Face2Face shows no shift.</w:t>
+      </w:r>
+    </w:p>
+    <w:tbl>
+      <w:tblPr>
+        <w:tblStyle w:val="LightGrid-Accent1"/>
+        <w:tblW w:type="auto" w:w="0"/>
+        <w:jc w:val="center"/>
+        <w:tblLayout w:type="fixed"/>
+        <w:tblLook w:firstColumn="1" w:firstRow="1" w:lastColumn="0" w:lastRow="0" w:noHBand="0" w:noVBand="1" w:val="04A0"/>
+      </w:tblPr>
+      <w:tblGrid>
+        <w:gridCol w:w="2016"/>
+        <w:gridCol w:w="3456"/>
+        <w:gridCol w:w="3456"/>
+      </w:tblGrid>
+      <w:tr>
+        <w:tc>
+          <w:tcPr>
+            <w:tcW w:type="dxa" w:w="2016"/>
+          </w:tcPr>
+          <w:p>
+            <w:r>
+              <w:rPr>
+                <w:b/>
+                <w:sz w:val="20"/>
+              </w:rPr>
+              <w:t>Method vs. real</w:t>
+            </w:r>
+          </w:p>
+        </w:tc>
+        <w:tc>
+          <w:tcPr>
+            <w:tcW w:type="dxa" w:w="3456"/>
+          </w:tcPr>
+          <w:p>
+            <w:r>
+              <w:rPr>
+                <w:b/>
+                <w:sz w:val="20"/>
+              </w:rPr>
+              <w:t>Original crops: d [95% CI]</w:t>
+            </w:r>
+          </w:p>
+        </w:tc>
+        <w:tc>
+          <w:tcPr>
+            <w:tcW w:type="dxa" w:w="3456"/>
+          </w:tcPr>
+          <w:p>
+            <w:r>
+              <w:rPr>
+                <w:b/>
+                <w:sz w:val="20"/>
+              </w:rPr>
+              <w:t>Reference crops: d [95% CI]</w:t>
+            </w:r>
+          </w:p>
+        </w:tc>
+      </w:tr>
+      <w:tr>
+        <w:tc>
+          <w:tcPr>
+            <w:tcW w:type="dxa" w:w="2016"/>
+          </w:tcPr>
+          <w:p>
+            <w:r>
+              <w:rPr>
+                <w:sz w:val="20"/>
+              </w:rPr>
+              <w:t>DF</w:t>
+            </w:r>
+          </w:p>
+        </w:tc>
+        <w:tc>
+          <w:tcPr>
+            <w:tcW w:type="dxa" w:w="3456"/>
+          </w:tcPr>
+          <w:p>
+            <w:r>
+              <w:rPr>
+                <w:sz w:val="20"/>
+              </w:rPr>
+              <w:t>-0.48 [-0.72, -0.26]</w:t>
+            </w:r>
+          </w:p>
+        </w:tc>
+        <w:tc>
+          <w:tcPr>
+            <w:tcW w:type="dxa" w:w="3456"/>
+          </w:tcPr>
+          <w:p>
+            <w:r>
+              <w:rPr>
+                <w:sz w:val="20"/>
+              </w:rPr>
+              <w:t>-0.36 [-0.60, -0.14]</w:t>
+            </w:r>
+          </w:p>
+        </w:tc>
+      </w:tr>
+      <w:tr>
+        <w:tc>
+          <w:tcPr>
+            <w:tcW w:type="dxa" w:w="2016"/>
+          </w:tcPr>
+          <w:p>
+            <w:r>
+              <w:rPr>
+                <w:sz w:val="20"/>
+              </w:rPr>
+              <w:t>F2F</w:t>
+            </w:r>
+          </w:p>
+        </w:tc>
+        <w:tc>
+          <w:tcPr>
+            <w:tcW w:type="dxa" w:w="3456"/>
+          </w:tcPr>
+          <w:p>
+            <w:r>
+              <w:rPr>
+                <w:sz w:val="20"/>
+              </w:rPr>
+              <w:t>-0.01 [-0.23, 0.24]</w:t>
+            </w:r>
+          </w:p>
+        </w:tc>
+        <w:tc>
+          <w:tcPr>
+            <w:tcW w:type="dxa" w:w="3456"/>
+          </w:tcPr>
+          <w:p>
+            <w:r>
+              <w:rPr>
+                <w:sz w:val="20"/>
+              </w:rPr>
+              <w:t>-0.02 [-0.25, 0.21]</w:t>
+            </w:r>
+          </w:p>
+        </w:tc>
+      </w:tr>
+      <w:tr>
+        <w:tc>
+          <w:tcPr>
+            <w:tcW w:type="dxa" w:w="2016"/>
+          </w:tcPr>
+          <w:p>
+            <w:r>
+              <w:rPr>
+                <w:sz w:val="20"/>
+              </w:rPr>
+              <w:t>FS</w:t>
+            </w:r>
+          </w:p>
+        </w:tc>
+        <w:tc>
+          <w:tcPr>
+            <w:tcW w:type="dxa" w:w="3456"/>
+          </w:tcPr>
+          <w:p>
+            <w:r>
+              <w:rPr>
+                <w:sz w:val="20"/>
+              </w:rPr>
+              <w:t>+0.37 [0.11, 0.66]</w:t>
+            </w:r>
+          </w:p>
+        </w:tc>
+        <w:tc>
+          <w:tcPr>
+            <w:tcW w:type="dxa" w:w="3456"/>
+          </w:tcPr>
+          <w:p>
+            <w:r>
+              <w:rPr>
+                <w:sz w:val="20"/>
+              </w:rPr>
+              <w:t>+0.33 [0.09, 0.58]</w:t>
+            </w:r>
+          </w:p>
+        </w:tc>
+      </w:tr>
+      <w:tr>
+        <w:tc>
+          <w:tcPr>
+            <w:tcW w:type="dxa" w:w="2016"/>
+          </w:tcPr>
+          <w:p>
+            <w:r>
+              <w:rPr>
+                <w:sz w:val="20"/>
+              </w:rPr>
+              <w:t>NT</w:t>
+            </w:r>
+          </w:p>
+        </w:tc>
+        <w:tc>
+          <w:tcPr>
+            <w:tcW w:type="dxa" w:w="3456"/>
+          </w:tcPr>
+          <w:p>
+            <w:r>
+              <w:rPr>
+                <w:sz w:val="20"/>
+              </w:rPr>
+              <w:t>-0.39 [-0.61, -0.15]</w:t>
+            </w:r>
+          </w:p>
+        </w:tc>
+        <w:tc>
+          <w:tcPr>
+            <w:tcW w:type="dxa" w:w="3456"/>
+          </w:tcPr>
+          <w:p>
+            <w:r>
+              <w:rPr>
+                <w:sz w:val="20"/>
+              </w:rPr>
+              <w:t>-0.30 [-0.52, -0.08]</w:t>
+            </w:r>
+          </w:p>
+        </w:tc>
+      </w:tr>
+    </w:tbl>
+    <w:p>
+      <w:r>
+        <w:t>A detector that learns "blurrier = fake" from Deepfakes will rank FaceSwap's sharper fakes as more real than real faces, hence AUC below 0.5. The product of effect sizes d(train) × d(test) predicts the transfer matrices: Spearman ρ = 0.92 (Xception) and 0.92 (CNN-ViT), each the best of all 24 relabelings of the methods (p = 0.042, the smallest this test can give). The same effect sizes, measured on our mirror crops, predict the official-data Xception matrix published in the Face X-ray paper with ρ = 0.73. On real test faces the Deepfakes-trained model scores blurrier faces as more fake (Laplacian variance ρ = -0.27, p = 0.001). Limits: nine statistics were tested and the permutation p cannot go below 1/24, so this is a strong candidate mechanism rather than proof.</w:t>
+      </w:r>
+    </w:p>
+    <w:p>
+      <w:pPr>
+        <w:jc w:val="center"/>
+      </w:pPr>
+      <w:r>
+        <w:drawing>
+          <wp:inline xmlns:a="http://schemas.openxmlformats.org/drawingml/2006/main" xmlns:pic="http://schemas.openxmlformats.org/drawingml/2006/picture">
+            <wp:extent cx="4206240" cy="2973812"/>
+            <wp:docPr id="5" name="Picture 5"/>
+            <wp:cNvGraphicFramePr>
+              <a:graphicFrameLocks noChangeAspect="1"/>
+            </wp:cNvGraphicFramePr>
+            <a:graphic>
+              <a:graphicData uri="http://schemas.openxmlformats.org/drawingml/2006/picture">
+                <pic:pic>
+                  <pic:nvPicPr>
+                    <pic:cNvPr id="0" name="F3_hf_effect_sizes.png"/>
+                    <pic:cNvPicPr/>
+                  </pic:nvPicPr>
+                  <pic:blipFill>
+                    <a:blip r:embed="rId13"/>
+                    <a:stretch>
+                      <a:fillRect/>
+                    </a:stretch>
+                  </pic:blipFill>
+                  <pic:spPr>
+                    <a:xfrm>
+                      <a:off x="0" y="0"/>
+                      <a:ext cx="4206240" cy="2973812"/>
+                    </a:xfrm>
+                    <a:prstGeom prst="rect"/>
+                  </pic:spPr>
+                </pic:pic>
+              </a:graphicData>
+            </a:graphic>
+          </wp:inline>
+        </w:drawing>
+      </w:r>
+    </w:p>
+    <w:p>
+      <w:pPr>
+        <w:jc w:val="center"/>
+      </w:pPr>
+      <w:r>
+        <w:rPr>
+          <w:i/>
+          <w:color w:val="475569"/>
+          <w:sz w:val="19"/>
+        </w:rPr>
+        <w:t>Figure 5. High-frequency energy, fakes vs. real (Cohen's d, 95% CI).</w:t>
+      </w:r>
+    </w:p>
+    <w:p>
+      <w:pPr>
+        <w:jc w:val="center"/>
+      </w:pPr>
+      <w:r>
+        <w:drawing>
+          <wp:inline xmlns:a="http://schemas.openxmlformats.org/drawingml/2006/main" xmlns:pic="http://schemas.openxmlformats.org/drawingml/2006/picture">
+            <wp:extent cx="4206240" cy="3452448"/>
+            <wp:docPr id="6" name="Picture 6"/>
+            <wp:cNvGraphicFramePr>
+              <a:graphicFrameLocks noChangeAspect="1"/>
+            </wp:cNvGraphicFramePr>
+            <a:graphic>
+              <a:graphicData uri="http://schemas.openxmlformats.org/drawingml/2006/picture">
+                <pic:pic>
+                  <pic:nvPicPr>
+                    <pic:cNvPr id="0" name="F4_sign_prediction.png"/>
+                    <pic:cNvPicPr/>
+                  </pic:nvPicPr>
+                  <pic:blipFill>
+                    <a:blip r:embed="rId14"/>
+                    <a:stretch>
+                      <a:fillRect/>
+                    </a:stretch>
+                  </pic:blipFill>
+                  <pic:spPr>
+                    <a:xfrm>
+                      <a:off x="0" y="0"/>
+                      <a:ext cx="4206240" cy="3452448"/>
+                    </a:xfrm>
+                    <a:prstGeom prst="rect"/>
+                  </pic:spPr>
+                </pic:pic>
+              </a:graphicData>
+            </a:graphic>
+          </wp:inline>
+        </w:drawing>
+      </w:r>
+    </w:p>
+    <w:p>
+      <w:pPr>
+        <w:jc w:val="center"/>
+      </w:pPr>
+      <w:r>
+        <w:rPr>
+          <w:i/>
+          <w:color w:val="475569"/>
+          <w:sz w:val="19"/>
+        </w:rPr>
+        <w:t>Figure 6. Predicted d(train) × d(test) vs. observed cross-manipulation AUC.</w:t>
+      </w:r>
+    </w:p>
+    <w:p>
+      <w:pPr>
+        <w:pStyle w:val="Heading2"/>
+      </w:pPr>
+      <w:r>
+        <w:t>7.4 Phase 4: Intervention — Randomizing Sharpness</w:t>
+      </w:r>
+    </w:p>
+    <w:p>
+      <w:r>
+        <w:t>Training with label-independent random blur or sharpening (probability 0.9) removes the Deepfakes sharpness cue and weakens the FaceSwap one. Change versus Phase 1, paired over the same test videos:</w:t>
+      </w:r>
+    </w:p>
+    <w:tbl>
+      <w:tblPr>
+        <w:tblStyle w:val="LightGrid-Accent1"/>
+        <w:tblW w:type="auto" w:w="0"/>
+        <w:jc w:val="center"/>
+        <w:tblLayout w:type="fixed"/>
+        <w:tblLook w:firstColumn="1" w:firstRow="1" w:lastColumn="0" w:lastRow="0" w:noHBand="0" w:noVBand="1" w:val="04A0"/>
+      </w:tblPr>
+      <w:tblGrid>
+        <w:gridCol w:w="1440"/>
+        <w:gridCol w:w="1296"/>
+        <w:gridCol w:w="3024"/>
+        <w:gridCol w:w="3168"/>
+      </w:tblGrid>
+      <w:tr>
+        <w:tc>
+          <w:tcPr>
+            <w:tcW w:type="dxa" w:w="1440"/>
+          </w:tcPr>
+          <w:p>
+            <w:r>
+              <w:rPr>
+                <w:b/>
+                <w:sz w:val="20"/>
+              </w:rPr>
+              <w:t>Cell</w:t>
+            </w:r>
+          </w:p>
+        </w:tc>
+        <w:tc>
+          <w:tcPr>
+            <w:tcW w:type="dxa" w:w="1296"/>
+          </w:tcPr>
+          <w:p>
+            <w:r>
+              <w:rPr>
+                <w:b/>
+                <w:sz w:val="20"/>
+              </w:rPr>
+              <w:t>Phase 1</w:t>
+            </w:r>
+          </w:p>
+        </w:tc>
+        <w:tc>
+          <w:tcPr>
+            <w:tcW w:type="dxa" w:w="3024"/>
+          </w:tcPr>
+          <w:p>
+            <w:r>
+              <w:rPr>
+                <w:b/>
+                <w:sz w:val="20"/>
+              </w:rPr>
+              <w:t>With augmentation</w:t>
+            </w:r>
+          </w:p>
+        </w:tc>
+        <w:tc>
+          <w:tcPr>
+            <w:tcW w:type="dxa" w:w="3168"/>
+          </w:tcPr>
+          <w:p>
+            <w:r>
+              <w:rPr>
+                <w:b/>
+                <w:sz w:val="20"/>
+              </w:rPr>
+              <w:t>Change [95% CI]</w:t>
+            </w:r>
+          </w:p>
+        </w:tc>
+      </w:tr>
+      <w:tr>
+        <w:tc>
+          <w:tcPr>
+            <w:tcW w:type="dxa" w:w="1440"/>
+          </w:tcPr>
+          <w:p>
+            <w:r>
+              <w:rPr>
+                <w:b/>
+                <w:color w:val="B42E0A"/>
+                <w:sz w:val="20"/>
+              </w:rPr>
+              <w:t>DF → FS</w:t>
+            </w:r>
+          </w:p>
+        </w:tc>
+        <w:tc>
+          <w:tcPr>
+            <w:tcW w:type="dxa" w:w="1296"/>
+          </w:tcPr>
+          <w:p>
+            <w:r>
+              <w:rPr>
+                <w:b/>
+                <w:color w:val="B42E0A"/>
+                <w:sz w:val="20"/>
+              </w:rPr>
+              <w:t>0.258</w:t>
+            </w:r>
+          </w:p>
+        </w:tc>
+        <w:tc>
+          <w:tcPr>
+            <w:tcW w:type="dxa" w:w="3024"/>
+          </w:tcPr>
+          <w:p>
+            <w:r>
+              <w:rPr>
+                <w:b/>
+                <w:color w:val="B42E0A"/>
+                <w:sz w:val="20"/>
+              </w:rPr>
+              <w:t>0.356 [0.30, 0.41]</w:t>
+            </w:r>
+          </w:p>
+        </w:tc>
+        <w:tc>
+          <w:tcPr>
+            <w:tcW w:type="dxa" w:w="3168"/>
+          </w:tcPr>
+          <w:p>
+            <w:r>
+              <w:rPr>
+                <w:b/>
+                <w:color w:val="B42E0A"/>
+                <w:sz w:val="20"/>
+              </w:rPr>
+              <w:t>+0.098 [+0.070, +0.129]</w:t>
+            </w:r>
+          </w:p>
+        </w:tc>
+      </w:tr>
+      <w:tr>
+        <w:tc>
+          <w:tcPr>
+            <w:tcW w:type="dxa" w:w="1440"/>
+          </w:tcPr>
+          <w:p>
+            <w:r>
+              <w:rPr>
+                <w:b/>
+                <w:color w:val="B42E0A"/>
+                <w:sz w:val="20"/>
+              </w:rPr>
+              <w:t>FS → NT</w:t>
+            </w:r>
+          </w:p>
+        </w:tc>
+        <w:tc>
+          <w:tcPr>
+            <w:tcW w:type="dxa" w:w="1296"/>
+          </w:tcPr>
+          <w:p>
+            <w:r>
+              <w:rPr>
+                <w:b/>
+                <w:color w:val="B42E0A"/>
+                <w:sz w:val="20"/>
+              </w:rPr>
+              <w:t>0.428</w:t>
+            </w:r>
+          </w:p>
+        </w:tc>
+        <w:tc>
+          <w:tcPr>
+            <w:tcW w:type="dxa" w:w="3024"/>
+          </w:tcPr>
+          <w:p>
+            <w:r>
+              <w:rPr>
+                <w:b/>
+                <w:color w:val="B42E0A"/>
+                <w:sz w:val="20"/>
+              </w:rPr>
+              <w:t>0.521 [0.46, 0.58]</w:t>
+            </w:r>
+          </w:p>
+        </w:tc>
+        <w:tc>
+          <w:tcPr>
+            <w:tcW w:type="dxa" w:w="3168"/>
+          </w:tcPr>
+          <w:p>
+            <w:r>
+              <w:rPr>
+                <w:b/>
+                <w:color w:val="B42E0A"/>
+                <w:sz w:val="20"/>
+              </w:rPr>
+              <w:t>+0.093 [+0.059, +0.129]</w:t>
+            </w:r>
+          </w:p>
+        </w:tc>
+      </w:tr>
+      <w:tr>
+        <w:tc>
+          <w:tcPr>
+            <w:tcW w:type="dxa" w:w="1440"/>
+          </w:tcPr>
+          <w:p>
+            <w:r>
+              <w:rPr>
+                <w:sz w:val="20"/>
+              </w:rPr>
+              <w:t>FS → DF</w:t>
+            </w:r>
+          </w:p>
+        </w:tc>
+        <w:tc>
+          <w:tcPr>
+            <w:tcW w:type="dxa" w:w="1296"/>
+          </w:tcPr>
+          <w:p>
+            <w:r>
+              <w:rPr>
+                <w:sz w:val="20"/>
+              </w:rPr>
+              <w:t>0.469</w:t>
+            </w:r>
+          </w:p>
+        </w:tc>
+        <w:tc>
+          <w:tcPr>
+            <w:tcW w:type="dxa" w:w="3024"/>
+          </w:tcPr>
+          <w:p>
+            <w:r>
+              <w:rPr>
+                <w:sz w:val="20"/>
+              </w:rPr>
+              <w:t>0.574 [0.51, 0.63]</w:t>
+            </w:r>
+          </w:p>
+        </w:tc>
+        <w:tc>
+          <w:tcPr>
+            <w:tcW w:type="dxa" w:w="3168"/>
+          </w:tcPr>
+          <w:p>
+            <w:r>
+              <w:rPr>
+                <w:sz w:val="20"/>
+              </w:rPr>
+              <w:t>+0.105 [+0.071, +0.136]</w:t>
+            </w:r>
+          </w:p>
+        </w:tc>
+      </w:tr>
+      <w:tr>
+        <w:tc>
+          <w:tcPr>
+            <w:tcW w:type="dxa" w:w="1440"/>
+          </w:tcPr>
+          <w:p>
+            <w:r>
+              <w:rPr>
+                <w:sz w:val="20"/>
+              </w:rPr>
+              <w:t>DF → F2F</w:t>
+            </w:r>
+          </w:p>
+        </w:tc>
+        <w:tc>
+          <w:tcPr>
+            <w:tcW w:type="dxa" w:w="1296"/>
+          </w:tcPr>
+          <w:p>
+            <w:r>
+              <w:rPr>
+                <w:sz w:val="20"/>
+              </w:rPr>
+              <w:t>0.694</w:t>
+            </w:r>
+          </w:p>
+        </w:tc>
+        <w:tc>
+          <w:tcPr>
+            <w:tcW w:type="dxa" w:w="3024"/>
+          </w:tcPr>
+          <w:p>
+            <w:r>
+              <w:rPr>
+                <w:sz w:val="20"/>
+              </w:rPr>
+              <w:t>0.734 [0.69, 0.79]</w:t>
+            </w:r>
+          </w:p>
+        </w:tc>
+        <w:tc>
+          <w:tcPr>
+            <w:tcW w:type="dxa" w:w="3168"/>
+          </w:tcPr>
+          <w:p>
+            <w:r>
+              <w:rPr>
+                <w:sz w:val="20"/>
+              </w:rPr>
+              <w:t>+0.040 [+0.012, +0.070]</w:t>
+            </w:r>
+          </w:p>
+        </w:tc>
+      </w:tr>
+      <w:tr>
+        <w:tc>
+          <w:tcPr>
+            <w:tcW w:type="dxa" w:w="1440"/>
+          </w:tcPr>
+          <w:p>
+            <w:r>
+              <w:rPr>
+                <w:sz w:val="20"/>
+              </w:rPr>
+              <w:t>FS → F2F</w:t>
+            </w:r>
+          </w:p>
+        </w:tc>
+        <w:tc>
+          <w:tcPr>
+            <w:tcW w:type="dxa" w:w="1296"/>
+          </w:tcPr>
+          <w:p>
+            <w:r>
+              <w:rPr>
+                <w:sz w:val="20"/>
+              </w:rPr>
+              <w:t>0.678</w:t>
+            </w:r>
+          </w:p>
+        </w:tc>
+        <w:tc>
+          <w:tcPr>
+            <w:tcW w:type="dxa" w:w="3024"/>
+          </w:tcPr>
+          <w:p>
+            <w:r>
+              <w:rPr>
+                <w:sz w:val="20"/>
+              </w:rPr>
+              <w:t>0.630 [0.57, 0.69]</w:t>
+            </w:r>
+          </w:p>
+        </w:tc>
+        <w:tc>
+          <w:tcPr>
+            <w:tcW w:type="dxa" w:w="3168"/>
+          </w:tcPr>
+          <w:p>
+            <w:r>
+              <w:rPr>
+                <w:sz w:val="20"/>
+              </w:rPr>
+              <w:t>-0.048 [-0.081, -0.015]</w:t>
+            </w:r>
+          </w:p>
+        </w:tc>
+      </w:tr>
+      <w:tr>
+        <w:tc>
+          <w:tcPr>
+            <w:tcW w:type="dxa" w:w="1440"/>
+          </w:tcPr>
+          <w:p>
+            <w:r>
+              <w:rPr>
+                <w:sz w:val="20"/>
+              </w:rPr>
+              <w:t>DF → DF</w:t>
+            </w:r>
+          </w:p>
+        </w:tc>
+        <w:tc>
+          <w:tcPr>
+            <w:tcW w:type="dxa" w:w="1296"/>
+          </w:tcPr>
+          <w:p>
+            <w:r>
+              <w:rPr>
+                <w:sz w:val="20"/>
+              </w:rPr>
+              <w:t>1.000</w:t>
+            </w:r>
+          </w:p>
+        </w:tc>
+        <w:tc>
+          <w:tcPr>
+            <w:tcW w:type="dxa" w:w="3024"/>
+          </w:tcPr>
+          <w:p>
+            <w:r>
+              <w:rPr>
+                <w:sz w:val="20"/>
+              </w:rPr>
+              <w:t>1.000 [1.00, 1.00]</w:t>
+            </w:r>
+          </w:p>
+        </w:tc>
+        <w:tc>
+          <w:tcPr>
+            <w:tcW w:type="dxa" w:w="3168"/>
+          </w:tcPr>
+          <w:p>
+            <w:r>
+              <w:rPr>
+                <w:sz w:val="20"/>
+              </w:rPr>
+              <w:t>-0.000 [-0.001, +0.000]</w:t>
+            </w:r>
+          </w:p>
+        </w:tc>
+      </w:tr>
+      <w:tr>
+        <w:tc>
+          <w:tcPr>
+            <w:tcW w:type="dxa" w:w="1440"/>
+          </w:tcPr>
+          <w:p>
+            <w:r>
+              <w:rPr>
+                <w:sz w:val="20"/>
+              </w:rPr>
+              <w:t>FS → FS</w:t>
+            </w:r>
+          </w:p>
+        </w:tc>
+        <w:tc>
+          <w:tcPr>
+            <w:tcW w:type="dxa" w:w="1296"/>
+          </w:tcPr>
+          <w:p>
+            <w:r>
+              <w:rPr>
+                <w:sz w:val="20"/>
+              </w:rPr>
+              <w:t>1.000</w:t>
+            </w:r>
+          </w:p>
+        </w:tc>
+        <w:tc>
+          <w:tcPr>
+            <w:tcW w:type="dxa" w:w="3024"/>
+          </w:tcPr>
+          <w:p>
+            <w:r>
+              <w:rPr>
+                <w:sz w:val="20"/>
+              </w:rPr>
+              <w:t>1.000 [1.00, 1.00]</w:t>
+            </w:r>
+          </w:p>
+        </w:tc>
+        <w:tc>
+          <w:tcPr>
+            <w:tcW w:type="dxa" w:w="3168"/>
+          </w:tcPr>
+          <w:p>
+            <w:r>
+              <w:rPr>
+                <w:sz w:val="20"/>
+              </w:rPr>
+              <w:t>+0.000 [-0.000, +0.001]</w:t>
+            </w:r>
+          </w:p>
+        </w:tc>
+      </w:tr>
+    </w:tbl>
+    <w:p>
+      <w:r>
+        <w:t>Both below-chance cells meet the success criterion set in advance (CI excludes the Phase 1 mean, no in-domain cost): FS→NT is no longer below chance, but DF→FS still is. The directional prediction made beforehand (DF→FS would recover more than FS→NT) failed — both rose by about 0.1 — and FS→F2F dropped. Sharpness is a causal but partial contributor to the inversion.</w:t>
+      </w:r>
+    </w:p>
+    <w:p>
+      <w:pPr>
+        <w:jc w:val="center"/>
+      </w:pPr>
+      <w:r>
+        <w:drawing>
+          <wp:inline xmlns:a="http://schemas.openxmlformats.org/drawingml/2006/main" xmlns:pic="http://schemas.openxmlformats.org/drawingml/2006/picture">
+            <wp:extent cx="4206240" cy="3178508"/>
+            <wp:docPr id="7" name="Picture 7"/>
+            <wp:cNvGraphicFramePr>
+              <a:graphicFrameLocks noChangeAspect="1"/>
+            </wp:cNvGraphicFramePr>
+            <a:graphic>
+              <a:graphicData uri="http://schemas.openxmlformats.org/drawingml/2006/picture">
+                <pic:pic>
+                  <pic:nvPicPr>
+                    <pic:cNvPr id="0" name="F5_intervention.png"/>
+                    <pic:cNvPicPr/>
+                  </pic:nvPicPr>
+                  <pic:blipFill>
+                    <a:blip r:embed="rId15"/>
+                    <a:stretch>
+                      <a:fillRect/>
+                    </a:stretch>
+                  </pic:blipFill>
+                  <pic:spPr>
+                    <a:xfrm>
+                      <a:off x="0" y="0"/>
+                      <a:ext cx="4206240" cy="3178508"/>
+                    </a:xfrm>
+                    <a:prstGeom prst="rect"/>
+                  </pic:spPr>
+                </pic:pic>
+              </a:graphicData>
+            </a:graphic>
+          </wp:inline>
+        </w:drawing>
+      </w:r>
+    </w:p>
+    <w:p>
+      <w:pPr>
+        <w:jc w:val="center"/>
+      </w:pPr>
+      <w:r>
+        <w:rPr>
+          <w:i/>
+          <w:color w:val="475569"/>
+          <w:sz w:val="19"/>
+        </w:rPr>
+        <w:t>Figure 7. Off-diagonal AUC with and without blur/sharpen randomization.</w:t>
+      </w:r>
+    </w:p>
+    <w:p>
+      <w:pPr>
+        <w:pStyle w:val="Heading2"/>
+      </w:pPr>
+      <w:r>
+        <w:t>7.5 Phase 5: Architecture Independence</w:t>
+      </w:r>
+    </w:p>
+    <w:p>
+      <w:r>
+        <w:t>ImageNet-pretrained ResNet-50 and EfficientNet-B4 at Xception's 299 px input (EfficientNet-B4 at batch 16, the largest that fits in 6 GB) repeat the reference-pipeline experiment.</w:t>
+      </w:r>
+    </w:p>
+    <w:tbl>
+      <w:tblPr>
+        <w:tblStyle w:val="LightGrid-Accent1"/>
+        <w:tblW w:type="auto" w:w="0"/>
+        <w:jc w:val="center"/>
+        <w:tblLayout w:type="fixed"/>
+        <w:tblLook w:firstColumn="1" w:firstRow="1" w:lastColumn="0" w:lastRow="0" w:noHBand="0" w:noVBand="1" w:val="04A0"/>
+      </w:tblPr>
+      <w:tblGrid>
+        <w:gridCol w:w="2448"/>
+        <w:gridCol w:w="2592"/>
+        <w:gridCol w:w="2592"/>
+        <w:gridCol w:w="1440"/>
+      </w:tblGrid>
+      <w:tr>
+        <w:tc>
+          <w:tcPr>
+            <w:tcW w:type="dxa" w:w="2448"/>
+          </w:tcPr>
+          <w:p>
+            <w:r>
+              <w:rPr>
+                <w:b/>
+                <w:sz w:val="20"/>
+              </w:rPr>
+              <w:t>Backbone</w:t>
+            </w:r>
+          </w:p>
+        </w:tc>
+        <w:tc>
+          <w:tcPr>
+            <w:tcW w:type="dxa" w:w="2592"/>
+          </w:tcPr>
+          <w:p>
+            <w:r>
+              <w:rPr>
+                <w:b/>
+                <w:sz w:val="20"/>
+              </w:rPr>
+              <w:t>DF → FS</w:t>
+            </w:r>
+          </w:p>
+        </w:tc>
+        <w:tc>
+          <w:tcPr>
+            <w:tcW w:type="dxa" w:w="2592"/>
+          </w:tcPr>
+          <w:p>
+            <w:r>
+              <w:rPr>
+                <w:b/>
+                <w:sz w:val="20"/>
+              </w:rPr>
+              <w:t>FS → NT</w:t>
             </w:r>
           </w:p>
         </w:tc>
@@ -2062,7 +3738,7 @@
                 <w:b/>
                 <w:sz w:val="20"/>
               </w:rPr>
-              <w:t>Status</w:t>
+              <w:t>Same call as Xception</w:t>
             </w:r>
           </w:p>
         </w:tc>
@@ -2070,27 +3746,40 @@
       <w:tr>
         <w:tc>
           <w:tcPr>
-            <w:tcW w:type="dxa" w:w="720"/>
+            <w:tcW w:type="dxa" w:w="2448"/>
           </w:tcPr>
           <w:p>
             <w:r>
               <w:rPr>
                 <w:sz w:val="20"/>
               </w:rPr>
-              <w:t>0</w:t>
+              <w:t>Xception (3 seeds)</w:t>
             </w:r>
           </w:p>
         </w:tc>
         <w:tc>
           <w:tcPr>
-            <w:tcW w:type="dxa" w:w="6624"/>
+            <w:tcW w:type="dxa" w:w="2592"/>
           </w:tcPr>
           <w:p>
             <w:r>
               <w:rPr>
                 <w:sz w:val="20"/>
               </w:rPr>
-              <w:t>Hygiene fixes + confound audit</w:t>
+              <w:t>0.258</w:t>
+            </w:r>
+          </w:p>
+        </w:tc>
+        <w:tc>
+          <w:tcPr>
+            <w:tcW w:type="dxa" w:w="2592"/>
+          </w:tcPr>
+          <w:p>
+            <w:r>
+              <w:rPr>
+                <w:sz w:val="20"/>
+              </w:rPr>
+              <w:t>0.428</w:t>
             </w:r>
           </w:p>
         </w:tc>
@@ -2103,7 +3792,7 @@
               <w:rPr>
                 <w:sz w:val="20"/>
               </w:rPr>
-              <w:t>Done</w:t>
+              <w:t>—</w:t>
             </w:r>
           </w:p>
         </w:tc>
@@ -2111,74 +3800,40 @@
       <w:tr>
         <w:tc>
           <w:tcPr>
-            <w:tcW w:type="dxa" w:w="720"/>
-          </w:tcPr>
-          <w:p>
-            <w:r>
-              <w:rPr>
-                <w:b/>
-                <w:color w:val="B42E0A"/>
-                <w:sz w:val="20"/>
-              </w:rPr>
-              <w:t>1</w:t>
-            </w:r>
-          </w:p>
-        </w:tc>
-        <w:tc>
-          <w:tcPr>
-            <w:tcW w:type="dxa" w:w="6624"/>
-          </w:tcPr>
-          <w:p>
-            <w:r>
-              <w:rPr>
-                <w:b/>
-                <w:color w:val="B42E0A"/>
-                <w:sz w:val="20"/>
-              </w:rPr>
-              <w:t>Reference-pipeline replication (dlib + alignment, standard settings) -- tests whether the inversion is preprocessing-driven or persists</w:t>
-            </w:r>
-          </w:p>
-        </w:tc>
-        <w:tc>
-          <w:tcPr>
-            <w:tcW w:type="dxa" w:w="1440"/>
-          </w:tcPr>
-          <w:p>
-            <w:r>
-              <w:rPr>
-                <w:b/>
-                <w:color w:val="B42E0A"/>
-                <w:sz w:val="20"/>
-              </w:rPr>
-              <w:t>Next</w:t>
-            </w:r>
-          </w:p>
-        </w:tc>
-      </w:tr>
-      <w:tr>
-        <w:tc>
-          <w:tcPr>
-            <w:tcW w:type="dxa" w:w="720"/>
+            <w:tcW w:type="dxa" w:w="2448"/>
           </w:tcPr>
           <w:p>
             <w:r>
               <w:rPr>
                 <w:sz w:val="20"/>
               </w:rPr>
-              <w:t>2</w:t>
+              <w:t>ResNet-50 (2 seeds)</w:t>
             </w:r>
           </w:p>
         </w:tc>
         <w:tc>
           <w:tcPr>
-            <w:tcW w:type="dxa" w:w="6624"/>
+            <w:tcW w:type="dxa" w:w="2592"/>
           </w:tcPr>
           <w:p>
             <w:r>
               <w:rPr>
                 <w:sz w:val="20"/>
               </w:rPr>
-              <w:t>Preprocessing sensitivity grid (C1)</w:t>
+              <w:t>0.291 [0.24, 0.35]</w:t>
+            </w:r>
+          </w:p>
+        </w:tc>
+        <w:tc>
+          <w:tcPr>
+            <w:tcW w:type="dxa" w:w="2592"/>
+          </w:tcPr>
+          <w:p>
+            <w:r>
+              <w:rPr>
+                <w:sz w:val="20"/>
+              </w:rPr>
+              <w:t>0.416 [0.35, 0.48]</w:t>
             </w:r>
           </w:p>
         </w:tc>
@@ -2191,7 +3846,7 @@
               <w:rPr>
                 <w:sz w:val="20"/>
               </w:rPr>
-              <w:t>Planned</w:t>
+              <w:t>8/8</w:t>
             </w:r>
           </w:p>
         </w:tc>
@@ -2199,27 +3854,40 @@
       <w:tr>
         <w:tc>
           <w:tcPr>
-            <w:tcW w:type="dxa" w:w="720"/>
+            <w:tcW w:type="dxa" w:w="2448"/>
           </w:tcPr>
           <w:p>
             <w:r>
               <w:rPr>
                 <w:sz w:val="20"/>
               </w:rPr>
-              <w:t>3</w:t>
+              <w:t>EfficientNet-B4 (2 seeds)</w:t>
             </w:r>
           </w:p>
         </w:tc>
         <w:tc>
           <w:tcPr>
-            <w:tcW w:type="dxa" w:w="6624"/>
+            <w:tcW w:type="dxa" w:w="2592"/>
           </w:tcPr>
           <w:p>
             <w:r>
               <w:rPr>
                 <w:sz w:val="20"/>
               </w:rPr>
-              <w:t>Mechanism: image statistics that predict the inversion sign (C2)</w:t>
+              <w:t>0.264 [0.22, 0.32]</w:t>
+            </w:r>
+          </w:p>
+        </w:tc>
+        <w:tc>
+          <w:tcPr>
+            <w:tcW w:type="dxa" w:w="2592"/>
+          </w:tcPr>
+          <w:p>
+            <w:r>
+              <w:rPr>
+                <w:sz w:val="20"/>
+              </w:rPr>
+              <w:t>0.361 [0.30, 0.42]</w:t>
             </w:r>
           </w:p>
         </w:tc>
@@ -2232,7 +3900,98 @@
               <w:rPr>
                 <w:sz w:val="20"/>
               </w:rPr>
-              <w:t>Planned</w:t>
+              <w:t>8/8</w:t>
+            </w:r>
+          </w:p>
+        </w:tc>
+      </w:tr>
+    </w:tbl>
+    <w:p>
+      <w:r>
+        <w:t>Both backbones give the same below/at/above-chance result as Xception in every cell. Together with the original CNN-ViT agreement (r = 0.94), this supports C4: the inversion is set by the training manipulation, not the network.</w:t>
+      </w:r>
+    </w:p>
+    <w:p>
+      <w:pPr>
+        <w:pStyle w:val="Heading2"/>
+      </w:pPr>
+      <w:r>
+        <w:t>7.6 Phase 6: External Check on DeepFakeFace</w:t>
+      </w:r>
+    </w:p>
+    <w:p>
+      <w:r>
+        <w:t>DeepFakeFace (IMDB-WIKI reals; Stable Diffusion inpainting, InsightFace swaps, Stable Diffusion text-to-image) was cropped with the reference pipeline and the FF++-trained Xception models evaluated without retraining. All three generators are blurrier than DeepFakeFace's real images, so the mechanism predicts that Deepfakes-trained models transfer and FaceSwap-trained models invert.</w:t>
+      </w:r>
+    </w:p>
+    <w:tbl>
+      <w:tblPr>
+        <w:tblStyle w:val="LightGrid-Accent1"/>
+        <w:tblW w:type="auto" w:w="0"/>
+        <w:jc w:val="center"/>
+        <w:tblLayout w:type="fixed"/>
+        <w:tblLook w:firstColumn="1" w:firstRow="1" w:lastColumn="0" w:lastRow="0" w:noHBand="0" w:noVBand="1" w:val="04A0"/>
+      </w:tblPr>
+      <w:tblGrid>
+        <w:gridCol w:w="2304"/>
+        <w:gridCol w:w="1008"/>
+        <w:gridCol w:w="2880"/>
+        <w:gridCol w:w="2880"/>
+      </w:tblGrid>
+      <w:tr>
+        <w:tc>
+          <w:tcPr>
+            <w:tcW w:type="dxa" w:w="2304"/>
+          </w:tcPr>
+          <w:p>
+            <w:r>
+              <w:rPr>
+                <w:b/>
+                <w:sz w:val="20"/>
+              </w:rPr>
+              <w:t>Generator</w:t>
+            </w:r>
+          </w:p>
+        </w:tc>
+        <w:tc>
+          <w:tcPr>
+            <w:tcW w:type="dxa" w:w="1008"/>
+          </w:tcPr>
+          <w:p>
+            <w:r>
+              <w:rPr>
+                <w:b/>
+                <w:sz w:val="20"/>
+              </w:rPr>
+              <w:t>hf d</w:t>
+            </w:r>
+          </w:p>
+        </w:tc>
+        <w:tc>
+          <w:tcPr>
+            <w:tcW w:type="dxa" w:w="2880"/>
+          </w:tcPr>
+          <w:p>
+            <w:r>
+              <w:rPr>
+                <w:b/>
+                <w:sz w:val="20"/>
+              </w:rPr>
+              <w:t>DF-trained AUC</w:t>
+            </w:r>
+          </w:p>
+        </w:tc>
+        <w:tc>
+          <w:tcPr>
+            <w:tcW w:type="dxa" w:w="2880"/>
+          </w:tcPr>
+          <w:p>
+            <w:r>
+              <w:rPr>
+                <w:b/>
+                <w:sz w:val="20"/>
+              </w:rPr>
+              <w:t>FS-trained AUC</w:t>
             </w:r>
           </w:p>
         </w:tc>
@@ -2240,40 +3999,53 @@
       <w:tr>
         <w:tc>
           <w:tcPr>
-            <w:tcW w:type="dxa" w:w="720"/>
+            <w:tcW w:type="dxa" w:w="2304"/>
           </w:tcPr>
           <w:p>
             <w:r>
               <w:rPr>
                 <w:sz w:val="20"/>
               </w:rPr>
-              <w:t>4</w:t>
+              <w:t>SD inpainting</w:t>
             </w:r>
           </w:p>
         </w:tc>
         <w:tc>
           <w:tcPr>
-            <w:tcW w:type="dxa" w:w="6624"/>
+            <w:tcW w:type="dxa" w:w="1008"/>
           </w:tcPr>
           <w:p>
             <w:r>
               <w:rPr>
                 <w:sz w:val="20"/>
               </w:rPr>
-              <w:t>Interventions that neutralize the responsible statistic (C3)</w:t>
+              <w:t>-0.26</w:t>
             </w:r>
           </w:p>
         </w:tc>
         <w:tc>
           <w:tcPr>
-            <w:tcW w:type="dxa" w:w="1440"/>
+            <w:tcW w:type="dxa" w:w="2880"/>
           </w:tcPr>
           <w:p>
             <w:r>
               <w:rPr>
                 <w:sz w:val="20"/>
               </w:rPr>
-              <w:t>Planned</w:t>
+              <w:t>0.463 [0.44, 0.49]</w:t>
+            </w:r>
+          </w:p>
+        </w:tc>
+        <w:tc>
+          <w:tcPr>
+            <w:tcW w:type="dxa" w:w="2880"/>
+          </w:tcPr>
+          <w:p>
+            <w:r>
+              <w:rPr>
+                <w:sz w:val="20"/>
+              </w:rPr>
+              <w:t>0.514 [0.49, 0.54]</w:t>
             </w:r>
           </w:p>
         </w:tc>
@@ -2281,40 +4053,53 @@
       <w:tr>
         <w:tc>
           <w:tcPr>
-            <w:tcW w:type="dxa" w:w="720"/>
+            <w:tcW w:type="dxa" w:w="2304"/>
           </w:tcPr>
           <w:p>
             <w:r>
               <w:rPr>
                 <w:sz w:val="20"/>
               </w:rPr>
-              <w:t>5</w:t>
+              <w:t>InsightFace</w:t>
             </w:r>
           </w:p>
         </w:tc>
         <w:tc>
           <w:tcPr>
-            <w:tcW w:type="dxa" w:w="6624"/>
+            <w:tcW w:type="dxa" w:w="1008"/>
           </w:tcPr>
           <w:p>
             <w:r>
               <w:rPr>
                 <w:sz w:val="20"/>
               </w:rPr>
-              <w:t>Architecture independence at scale (C4)</w:t>
+              <w:t>-0.52</w:t>
             </w:r>
           </w:p>
         </w:tc>
         <w:tc>
           <w:tcPr>
-            <w:tcW w:type="dxa" w:w="1440"/>
+            <w:tcW w:type="dxa" w:w="2880"/>
           </w:tcPr>
           <w:p>
             <w:r>
               <w:rPr>
                 <w:sz w:val="20"/>
               </w:rPr>
-              <w:t>Planned</w:t>
+              <w:t>0.654 [0.63, 0.68]</w:t>
+            </w:r>
+          </w:p>
+        </w:tc>
+        <w:tc>
+          <w:tcPr>
+            <w:tcW w:type="dxa" w:w="2880"/>
+          </w:tcPr>
+          <w:p>
+            <w:r>
+              <w:rPr>
+                <w:sz w:val="20"/>
+              </w:rPr>
+              <w:t>0.491 [0.46, 0.52]</w:t>
             </w:r>
           </w:p>
         </w:tc>
@@ -2322,81 +4107,53 @@
       <w:tr>
         <w:tc>
           <w:tcPr>
-            <w:tcW w:type="dxa" w:w="720"/>
+            <w:tcW w:type="dxa" w:w="2304"/>
           </w:tcPr>
           <w:p>
             <w:r>
               <w:rPr>
                 <w:sz w:val="20"/>
               </w:rPr>
-              <w:t>6</w:t>
+              <w:t>SD text-to-image</w:t>
             </w:r>
           </w:p>
         </w:tc>
         <w:tc>
           <w:tcPr>
-            <w:tcW w:type="dxa" w:w="6624"/>
+            <w:tcW w:type="dxa" w:w="1008"/>
           </w:tcPr>
           <w:p>
             <w:r>
               <w:rPr>
                 <w:sz w:val="20"/>
               </w:rPr>
-              <w:t>External validity (licensed dataset / non-FF++ track)</w:t>
+              <w:t>-0.40</w:t>
             </w:r>
           </w:p>
         </w:tc>
         <w:tc>
           <w:tcPr>
-            <w:tcW w:type="dxa" w:w="1440"/>
+            <w:tcW w:type="dxa" w:w="2880"/>
           </w:tcPr>
           <w:p>
             <w:r>
               <w:rPr>
                 <w:sz w:val="20"/>
               </w:rPr>
-              <w:t>Planned</w:t>
+              <w:t>0.323 [0.30, 0.34]</w:t>
             </w:r>
           </w:p>
         </w:tc>
-      </w:tr>
-      <w:tr>
         <w:tc>
           <w:tcPr>
-            <w:tcW w:type="dxa" w:w="720"/>
+            <w:tcW w:type="dxa" w:w="2880"/>
           </w:tcPr>
           <w:p>
             <w:r>
               <w:rPr>
                 <w:sz w:val="20"/>
               </w:rPr>
-              <w:t>7</w:t>
-            </w:r>
-          </w:p>
-        </w:tc>
-        <w:tc>
-          <w:tcPr>
-            <w:tcW w:type="dxa" w:w="6624"/>
-          </w:tcPr>
-          <w:p>
-            <w:r>
-              <w:rPr>
-                <w:sz w:val="20"/>
-              </w:rPr>
-              <w:t>Write-up assets and paper draft</w:t>
-            </w:r>
-          </w:p>
-        </w:tc>
-        <w:tc>
-          <w:tcPr>
-            <w:tcW w:type="dxa" w:w="1440"/>
-          </w:tcPr>
-          <w:p>
-            <w:r>
-              <w:rPr>
-                <w:sz w:val="20"/>
-              </w:rPr>
-              <w:t>Planned</w:t>
+              <w:t>0.399 [0.38, 0.42]</w:t>
             </w:r>
           </w:p>
         </w:tc>
@@ -2404,7 +4161,7 @@
     </w:tbl>
     <w:p>
       <w:r>
-        <w:t>Target venue: a 4-6 page paper in an IEEE WIFS/ICASSP-style format. Total time budget for the plan is approximately 4 weeks; the project is currently at the start of Phase 1.</w:t>
+        <w:t>The prediction is right in 2 of 4 decided cells — no better than chance — and SD text-to-image fakes score below chance for every detector. Across datasets, something other than sharpness dominates; the high-frequency account is a within-FaceForensics++ explanation. (Face detection succeeded at different rates per class, 64–90%, a possible selection bias.)</w:t>
       </w:r>
     </w:p>
     <w:p>
@@ -2412,7 +4169,7 @@
         <w:pStyle w:val="Heading2"/>
       </w:pPr>
       <w:r>
-        <w:t>7.3 Current Status</w:t>
+        <w:t>7.7 Verdict on the Claims</w:t>
       </w:r>
     </w:p>
     <w:p>
@@ -2420,7 +4177,13 @@
         <w:pStyle w:val="ListBullet"/>
       </w:pPr>
       <w:r>
-        <w:t>Phases 0 complete: hygiene fixes committed, confound audit complete, GATE 0 resolved (no confound found; continuing per the brief's own rule).</w:t>
+        <w:rPr>
+          <w:b/>
+        </w:rPr>
+        <w:t xml:space="preserve">C1 (preprocessing) — not supported. </w:t>
+      </w:r>
+      <w:r>
+        <w:t>The inversion survives a full preprocessing change and the one-factor grid (§7.1–7.2).</w:t>
       </w:r>
     </w:p>
     <w:p>
@@ -2428,7 +4191,13 @@
         <w:pStyle w:val="ListBullet"/>
       </w:pPr>
       <w:r>
-        <w:t>Experiments 1-3 (baseline, cross-manipulation, compression robustness), Grad-CAM, and the live demo are all complete -- the full basis for this report.</w:t>
+        <w:rPr>
+          <w:b/>
+        </w:rPr>
+        <w:t xml:space="preserve">C2 (mechanism) — supported within FF++. </w:t>
+      </w:r>
+      <w:r>
+        <w:t>High-frequency energy predicts our and published FF++ matrices; it does not predict transfer to DeepFakeFace (§7.3, §7.6).</w:t>
       </w:r>
     </w:p>
     <w:p>
@@ -2436,7 +4205,13 @@
         <w:pStyle w:val="ListBullet"/>
       </w:pPr>
       <w:r>
-        <w:t>Architecture-independence of the transfer-failure pattern is confirmed at the correlation level (§5); Phase 5 will test it across more architectures.</w:t>
+        <w:rPr>
+          <w:b/>
+        </w:rPr>
+        <w:t xml:space="preserve">C3 (intervention) — partially supported. </w:t>
+      </w:r>
+      <w:r>
+        <w:t>Randomizing sharpness raises every inverted cell by about 0.1 AUC at no in-domain cost, but DF→FS stays below chance (§7.4).</w:t>
       </w:r>
     </w:p>
     <w:p>
@@ -2444,7 +4219,18 @@
         <w:pStyle w:val="ListBullet"/>
       </w:pPr>
       <w:r>
-        <w:t>Phase 1 (reference-pipeline rebuild and retrain) is the immediate next step -- see “Let us start the work” below.</w:t>
+        <w:rPr>
+          <w:b/>
+        </w:rPr>
+        <w:t xml:space="preserve">C4 (architecture independence) — supported. </w:t>
+      </w:r>
+      <w:r>
+        <w:t>Three pretrained CNNs agree in every cell (§7.5).</w:t>
+      </w:r>
+    </w:p>
+    <w:p>
+      <w:r>
+        <w:t>A paper draft built from these results is in paper/main.tex (IEEE conference format).</w:t>
       </w:r>
     </w:p>
     <w:p>
@@ -2460,7 +4246,7 @@
         <w:pStyle w:val="ListBullet"/>
       </w:pPr>
       <w:r>
-        <w:t>All results in this report are derived from a Kaggle mirror of FaceForensics++ (xdxd003/ff-c23), not the official release. Official access is still pending; results are labeled "mirror, preliminary" throughout and the research plan treats mirror-vs-official as an open comparison, not an assumption.</w:t>
+        <w:t>All FaceForensics++ results use a Kaggle mirror, not the official release (access still pending). Agreement with the official-data matrix published in the Face X-ray paper (§7.3) mitigates but does not remove this.</w:t>
       </w:r>
     </w:p>
     <w:p>
@@ -2468,7 +4254,7 @@
         <w:pStyle w:val="ListBullet"/>
       </w:pPr>
       <w:r>
-        <w:t>Compression-robustness results (§4.3) use a proxy c40 (c23 re-compressed a second time), which is harsher than genuine c40 and is not a substitute for it.</w:t>
+        <w:t>The sign test has only four manipulation methods, so its permutation p cannot fall below 1/24; nine statistics were tested and the sharpness statistics are correlated with each other.</w:t>
       </w:r>
     </w:p>
     <w:p>
@@ -2476,7 +4262,7 @@
         <w:pStyle w:val="ListBullet"/>
       </w:pPr>
       <w:r>
-        <w:t>Experiments 1-3 use a single seed (42) and report point estimates without bootstrap confidence intervals. The new research plan raises this bar (≥3 seeds, bootstrap CIs) starting with Phase 1.</w:t>
+        <w:t>Experiments 1-3 (§4) are single-seed point estimates. The research phases use three (Xception) or two seeds with bootstrap CIs; Phase 2 and Phase 5 runs use early-stopping patience 2 instead of 4, and EfficientNet-B4 batch 16, both documented in docs/PROGRESS.md.</w:t>
       </w:r>
     </w:p>
     <w:p>
@@ -2484,7 +4270,7 @@
         <w:pStyle w:val="ListBullet"/>
       </w:pPr>
       <w:r>
-        <w:t>The architecture comparison (XceptionNet vs. CNN-ViT hybrid) is confounded by pretraining status and input resolution (299px vs. 224px); no general claim about which architecture is "better" is made.</w:t>
+        <w:t>The original XceptionNet vs. CNN-ViT comparison is confounded by pretraining and input resolution (299 vs. 224 px); Phase 5 removes that confound for the pretrained backbones.</w:t>
       </w:r>
     </w:p>
     <w:p>
@@ -2492,7 +4278,15 @@
         <w:pStyle w:val="ListBullet"/>
       </w:pPr>
       <w:r>
-        <w:t>All experiments run on a single consumer GPU (RTX 3060 Laptop, 6GB VRAM), which bounds the scale of the preprocessing-sensitivity and architecture sweeps in Phases 2 and 5.</w:t>
+        <w:t>Compression results (§4.3) use a proxy c40 (c23 re-compressed), not official c40.</w:t>
+      </w:r>
+    </w:p>
+    <w:p>
+      <w:pPr>
+        <w:pStyle w:val="ListBullet"/>
+      </w:pPr>
+      <w:r>
+        <w:t>All experiments ran on one 6 GB laptop GPU, which limited the preprocessing grid to variants derivable from existing crops.</w:t>
       </w:r>
     </w:p>
     <w:p>
@@ -2505,7 +4299,7 @@
     </w:p>
     <w:p>
       <w:r>
-        <w:t>The project has moved from a straightforward architecture comparison to a more consequential finding: cross-manipulation transfer between deepfake detection methods can invert below random chance, this pattern is consistent across two structurally different architectures, and it survives a dedicated audit for trivial pipeline explanations. All planned baseline experiments are complete, the finding has been verified against the project's own ground rules for reproducibility, and a phased plan with explicit, falsifiable claims is in place to explain and fix it. The immediate next step is Phase 1: rebuilding the preprocessing pipeline with a different, standard face-alignment method to test directly whether the inversion is preprocessing-driven or a genuine mechanism.</w:t>
+        <w:t>The project began as an architecture comparison — XceptionNet beat the CNN-ViT hybrid, a reported negative result — and turned into a finding about why detectors fail on unseen manipulations. Some cross-manipulation cells on FaceForensics++ fall below chance; this survives every preprocessing change tested and appears in three different pretrained architectures. It follows a measurable difference in high-frequency energy whose direction flips between manipulation methods, which predicts both our transfer matrices and a published official-data matrix. Randomizing that cue during training reduces the inversion by about 0.1 AUC at no in-domain cost, but does not remove it, and the explanation does not carry over to a second dataset. Detectors' cross-method scores should be read with such signed shortcut cues in mind.</w:t>
       </w:r>
     </w:p>
     <w:p>

</xml_diff>

<commit_message>
Project report: final version with Phase 2 results
</commit_message>
<xml_diff>
--- a/docs/project_report.docx
+++ b/docs/project_report.docx
@@ -2578,7 +2578,7 @@
               <w:rPr>
                 <w:sz w:val="20"/>
               </w:rPr>
-              <w:t>pending</w:t>
+              <w:t>0.286 [0.24, 0.34]</w:t>
             </w:r>
           </w:p>
         </w:tc>
@@ -2591,7 +2591,7 @@
               <w:rPr>
                 <w:sz w:val="20"/>
               </w:rPr>
-              <w:t>pending</w:t>
+              <w:t>0.442 [0.38, 0.50]</w:t>
             </w:r>
           </w:p>
         </w:tc>
@@ -2632,7 +2632,7 @@
               <w:rPr>
                 <w:sz w:val="20"/>
               </w:rPr>
-              <w:t>pending</w:t>
+              <w:t>0.290 [0.24, 0.35]</w:t>
             </w:r>
           </w:p>
         </w:tc>
@@ -2645,7 +2645,7 @@
               <w:rPr>
                 <w:sz w:val="20"/>
               </w:rPr>
-              <w:t>pending</w:t>
+              <w:t>0.472 [0.41, 0.53]</w:t>
             </w:r>
           </w:p>
         </w:tc>
@@ -2686,7 +2686,7 @@
               <w:rPr>
                 <w:sz w:val="20"/>
               </w:rPr>
-              <w:t>pending</w:t>
+              <w:t>0.271 [0.22, 0.32]</w:t>
             </w:r>
           </w:p>
         </w:tc>
@@ -2699,7 +2699,7 @@
               <w:rPr>
                 <w:sz w:val="20"/>
               </w:rPr>
-              <w:t>pending</w:t>
+              <w:t>0.422 [0.36, 0.48]</w:t>
             </w:r>
           </w:p>
         </w:tc>
@@ -2740,7 +2740,7 @@
               <w:rPr>
                 <w:sz w:val="20"/>
               </w:rPr>
-              <w:t>pending</w:t>
+              <w:t>0.259 [0.21, 0.31]</w:t>
             </w:r>
           </w:p>
         </w:tc>
@@ -2753,7 +2753,7 @@
               <w:rPr>
                 <w:sz w:val="20"/>
               </w:rPr>
-              <w:t>pending</w:t>
+              <w:t>0.470 [0.41, 0.53]</w:t>
             </w:r>
           </w:p>
         </w:tc>
@@ -2772,11 +2772,6 @@
         </w:tc>
       </w:tr>
     </w:tbl>
-    <w:p>
-      <w:r>
-        <w:t>Pending at the time of this build: JPEG q95, JPEG q75, 10 frames/video, Tight 1.0× margin.</w:t>
-      </w:r>
-    </w:p>
     <w:p>
       <w:pPr>
         <w:pStyle w:val="Heading2"/>

</xml_diff>